<commit_message>
Test - Commented GitLatch Commit @ 2025-8-21-5-56-56-284
</commit_message>
<xml_diff>
--- a/Test446.docx
+++ b/Test446.docx
@@ -1,6 +1,6 @@
 
 <file path=word/document.xml><?xml version="1.0" encoding="utf-8"?>
-<w:document xmlns:wpc="http://schemas.microsoft.com/office/word/2010/wordprocessingCanvas" xmlns:cx="http://schemas.microsoft.com/office/drawing/2014/chartex" xmlns:cx1="http://schemas.microsoft.com/office/drawing/2015/9/8/chartex" xmlns:cx2="http://schemas.microsoft.com/office/drawing/2015/10/21/chartex" xmlns:cx3="http://schemas.microsoft.com/office/drawing/2016/5/9/chartex" xmlns:cx4="http://schemas.microsoft.com/office/drawing/2016/5/10/chartex" xmlns:cx5="http://schemas.microsoft.com/office/drawing/2016/5/11/chartex" xmlns:cx6="http://schemas.microsoft.com/office/drawing/2016/5/12/chartex" xmlns:cx7="http://schemas.microsoft.com/office/drawing/2016/5/13/chartex" xmlns:cx8="http://schemas.microsoft.com/office/drawing/2016/5/14/chartex" xmlns:mc="http://schemas.openxmlformats.org/markup-compatibility/2006" xmlns:aink="http://schemas.microsoft.com/office/drawing/2016/ink" xmlns:am3d="http://schemas.microsoft.com/office/drawing/2017/model3d" xmlns:o="urn:schemas-microsoft-com:office:office" xmlns:oel="http://schemas.microsoft.com/office/2019/extlst" xmlns:r="http://schemas.openxmlformats.org/officeDocument/2006/relationships" xmlns:m="http://schemas.openxmlformats.org/officeDocument/2006/math" xmlns:v="urn:schemas-microsoft-com:vml" xmlns:wp14="http://schemas.microsoft.com/office/word/2010/wordprocessingDrawing" xmlns:wp="http://schemas.openxmlformats.org/drawingml/2006/wordprocessingDrawing" xmlns:w10="urn:schemas-microsoft-com:office:word" xmlns:w="http://schemas.openxmlformats.org/wordprocessingml/2006/main" xmlns:w14="http://schemas.microsoft.com/office/word/2010/wordml" xmlns:w15="http://schemas.microsoft.com/office/word/2012/wordml" xmlns:w16cex="http://schemas.microsoft.com/office/word/2018/wordml/cex" xmlns:w16cid="http://schemas.microsoft.com/office/word/2016/wordml/cid" xmlns:w16="http://schemas.microsoft.com/office/word/2018/wordml" xmlns:w16sdtdh="http://schemas.microsoft.com/office/word/2020/wordml/sdtdatahash" xmlns:w16se="http://schemas.microsoft.com/office/word/2015/wordml/symex" xmlns:wpg="http://schemas.microsoft.com/office/word/2010/wordprocessingGroup" xmlns:wpi="http://schemas.microsoft.com/office/word/2010/wordprocessingInk" xmlns:wne="http://schemas.microsoft.com/office/word/2006/wordml" xmlns:wps="http://schemas.microsoft.com/office/word/2010/wordprocessingShape" mc:Ignorable="w14 w15 w16se w16cid w16 w16cex w16sdtdh wp14">
+<w:document xmlns:wpc="http://schemas.microsoft.com/office/word/2010/wordprocessingCanvas" xmlns:cx="http://schemas.microsoft.com/office/drawing/2014/chartex" xmlns:cx1="http://schemas.microsoft.com/office/drawing/2015/9/8/chartex" xmlns:cx2="http://schemas.microsoft.com/office/drawing/2015/10/21/chartex" xmlns:cx3="http://schemas.microsoft.com/office/drawing/2016/5/9/chartex" xmlns:cx4="http://schemas.microsoft.com/office/drawing/2016/5/10/chartex" xmlns:cx5="http://schemas.microsoft.com/office/drawing/2016/5/11/chartex" xmlns:cx6="http://schemas.microsoft.com/office/drawing/2016/5/12/chartex" xmlns:cx7="http://schemas.microsoft.com/office/drawing/2016/5/13/chartex" xmlns:cx8="http://schemas.microsoft.com/office/drawing/2016/5/14/chartex" xmlns:mc="http://schemas.openxmlformats.org/markup-compatibility/2006" xmlns:aink="http://schemas.microsoft.com/office/drawing/2016/ink" xmlns:am3d="http://schemas.microsoft.com/office/drawing/2017/model3d" xmlns:o="urn:schemas-microsoft-com:office:office" xmlns:oel="http://schemas.microsoft.com/office/2019/extlst" xmlns:r="http://schemas.openxmlformats.org/officeDocument/2006/relationships" xmlns:m="http://schemas.openxmlformats.org/officeDocument/2006/math" xmlns:v="urn:schemas-microsoft-com:vml" xmlns:wp14="http://schemas.microsoft.com/office/word/2010/wordprocessingDrawing" xmlns:wp="http://schemas.openxmlformats.org/drawingml/2006/wordprocessingDrawing" xmlns:w10="urn:schemas-microsoft-com:office:word" xmlns:w="http://schemas.openxmlformats.org/wordprocessingml/2006/main" xmlns:w14="http://schemas.microsoft.com/office/word/2010/wordml" xmlns:w15="http://schemas.microsoft.com/office/word/2012/wordml" xmlns:w16cex="http://schemas.microsoft.com/office/word/2018/wordml/cex" xmlns:w16cid="http://schemas.microsoft.com/office/word/2016/wordml/cid" xmlns:w16="http://schemas.microsoft.com/office/word/2018/wordml" xmlns:w16du="http://schemas.microsoft.com/office/word/2023/wordml/word16du" xmlns:w16sdtdh="http://schemas.microsoft.com/office/word/2020/wordml/sdtdatahash" xmlns:w16sdtfl="http://schemas.microsoft.com/office/word/2024/wordml/sdtformatlock" xmlns:w16se="http://schemas.microsoft.com/office/word/2015/wordml/symex" xmlns:wpg="http://schemas.microsoft.com/office/word/2010/wordprocessingGroup" xmlns:wpi="http://schemas.microsoft.com/office/word/2010/wordprocessingInk" xmlns:wne="http://schemas.microsoft.com/office/word/2006/wordml" xmlns:wps="http://schemas.microsoft.com/office/word/2010/wordprocessingShape" mc:Ignorable="w14 w15 w16se w16cid w16 w16cex w16sdtdh w16sdtfl w16du wp14">
   <w:body>
     <w:p>
       <w:r>
@@ -26,7 +26,7 @@
 </file>
 
 <file path=word/styles.xml><?xml version="1.0" encoding="utf-8"?>
-<w:styles xmlns:mc="http://schemas.openxmlformats.org/markup-compatibility/2006" xmlns:r="http://schemas.openxmlformats.org/officeDocument/2006/relationships" xmlns:w="http://schemas.openxmlformats.org/wordprocessingml/2006/main" xmlns:w14="http://schemas.microsoft.com/office/word/2010/wordml" xmlns:w15="http://schemas.microsoft.com/office/word/2012/wordml" xmlns:w16cex="http://schemas.microsoft.com/office/word/2018/wordml/cex" xmlns:w16cid="http://schemas.microsoft.com/office/word/2016/wordml/cid" xmlns:w16="http://schemas.microsoft.com/office/word/2018/wordml" xmlns:w16sdtdh="http://schemas.microsoft.com/office/word/2020/wordml/sdtdatahash" xmlns:w16se="http://schemas.microsoft.com/office/word/2015/wordml/symex" mc:Ignorable="w14 w15 w16se w16cid w16 w16cex w16sdtdh">
+<w:styles xmlns:mc="http://schemas.openxmlformats.org/markup-compatibility/2006" xmlns:r="http://schemas.openxmlformats.org/officeDocument/2006/relationships" xmlns:w="http://schemas.openxmlformats.org/wordprocessingml/2006/main" xmlns:w14="http://schemas.microsoft.com/office/word/2010/wordml" xmlns:w15="http://schemas.microsoft.com/office/word/2012/wordml" xmlns:w16cex="http://schemas.microsoft.com/office/word/2018/wordml/cex" xmlns:w16cid="http://schemas.microsoft.com/office/word/2016/wordml/cid" xmlns:w16="http://schemas.microsoft.com/office/word/2018/wordml" xmlns:w16du="http://schemas.microsoft.com/office/word/2023/wordml/word16du" xmlns:w16sdtdh="http://schemas.microsoft.com/office/word/2020/wordml/sdtdatahash" xmlns:w16sdtfl="http://schemas.microsoft.com/office/word/2024/wordml/sdtformatlock" xmlns:w16se="http://schemas.microsoft.com/office/word/2015/wordml/symex" mc:Ignorable="w14 w15 w16se w16cid w16 w16cex w16sdtdh w16sdtfl w16du">
   <w:docDefaults>
     <w:rPrDefault>
       <w:rPr>
@@ -724,8 +724,8 @@
 </file>
 
 <file path=word/webextensions/webextension1.xml><?xml version="1.0" encoding="utf-8"?>
-<we:webextension xmlns:we="http://schemas.microsoft.com/office/webextensions/webextension/2010/11" id="{9A09BEEF-B5E3-4C2E-9431-8100321DC6ED}">
-  <we:reference id="0115cf6a-3048-47ca-abd1-7248654a3b50" version="1.0.0.3" store="developer" storeType="Registry"/>
+<we:webextension xmlns:we="http://schemas.microsoft.com/office/webextensions/webextension/2010/11" id="{966D6FE4-117D-4344-83C7-D455F0CD57EE}">
+  <we:reference id="0115cf6a-3048-47ca-abd1-7248654a3b50" version="1.0.0.6" store="//O-1908-Chr-1/Users/appsure/Desktop/Manifest" storeType="Filesystem"/>
   <we:alternateReferences/>
   <we:properties>
     <we:property name="Office.AutoShowTaskpaneWithDocument" value="true"/>

</xml_diff>

<commit_message>
Test - Commented GitLatch Commit @ 2025-8-21-5-57-59-545
</commit_message>
<xml_diff>
--- a/Test446.docx
+++ b/Test446.docx
@@ -13,6 +13,12 @@
       <w:proofErr w:type="spellEnd"/>
       <w:r>
         <w:t>.</w:t>
+      </w:r>
+    </w:p>
+    <w:p/>
+    <w:p>
+      <w:r>
+        <w:t>Testing is fun.</w:t>
       </w:r>
     </w:p>
     <w:sectPr>
@@ -717,7 +723,7 @@
 
 <file path=word/webextensions/taskpanes.xml><?xml version="1.0" encoding="utf-8"?>
 <wetp:taskpanes xmlns:wetp="http://schemas.microsoft.com/office/webextensions/taskpanes/2010/11">
-  <wetp:taskpane dockstate="right" visibility="0" width="525" row="0">
+  <wetp:taskpane dockstate="right" visibility="0" width="525" row="1">
     <wetp:webextensionref xmlns:r="http://schemas.openxmlformats.org/officeDocument/2006/relationships" r:id="rId1"/>
   </wetp:taskpane>
 </wetp:taskpanes>

</xml_diff>

<commit_message>
Test - Commented GitLatch Commit @ 2025-8-21-6-47-15-865
</commit_message>
<xml_diff>
--- a/Test446.docx
+++ b/Test446.docx
@@ -19,6 +19,12 @@
     <w:p>
       <w:r>
         <w:t>Testing is fun.</w:t>
+      </w:r>
+    </w:p>
+    <w:p/>
+    <w:p>
+      <w:r>
+        <w:t>Nikita</w:t>
       </w:r>
     </w:p>
     <w:sectPr>
@@ -723,14 +729,14 @@
 
 <file path=word/webextensions/taskpanes.xml><?xml version="1.0" encoding="utf-8"?>
 <wetp:taskpanes xmlns:wetp="http://schemas.microsoft.com/office/webextensions/taskpanes/2010/11">
-  <wetp:taskpane dockstate="right" visibility="0" width="525" row="1">
+  <wetp:taskpane dockstate="right" visibility="0" width="525" row="0">
     <wetp:webextensionref xmlns:r="http://schemas.openxmlformats.org/officeDocument/2006/relationships" r:id="rId1"/>
   </wetp:taskpane>
 </wetp:taskpanes>
 </file>
 
 <file path=word/webextensions/webextension1.xml><?xml version="1.0" encoding="utf-8"?>
-<we:webextension xmlns:we="http://schemas.microsoft.com/office/webextensions/webextension/2010/11" id="{966D6FE4-117D-4344-83C7-D455F0CD57EE}">
+<we:webextension xmlns:we="http://schemas.microsoft.com/office/webextensions/webextension/2010/11" id="{477DFDE2-273E-412C-BCAF-EC63F59C6FF9}">
   <we:reference id="0115cf6a-3048-47ca-abd1-7248654a3b50" version="1.0.0.6" store="//O-1908-Chr-1/Users/appsure/Desktop/Manifest" storeType="Filesystem"/>
   <we:alternateReferences/>
   <we:properties>

</xml_diff>

<commit_message>
Test - Commented GitLatch Commit @ 2025-8-21-6-51-5-776
</commit_message>
<xml_diff>
--- a/Test446.docx
+++ b/Test446.docx
@@ -25,6 +25,9 @@
     <w:p>
       <w:r>
         <w:t>Nikita</w:t>
+      </w:r>
+      <w:r>
+        <w:t xml:space="preserve"> 1234</w:t>
       </w:r>
     </w:p>
     <w:sectPr>
@@ -729,7 +732,7 @@
 
 <file path=word/webextensions/taskpanes.xml><?xml version="1.0" encoding="utf-8"?>
 <wetp:taskpanes xmlns:wetp="http://schemas.microsoft.com/office/webextensions/taskpanes/2010/11">
-  <wetp:taskpane dockstate="right" visibility="0" width="525" row="0">
+  <wetp:taskpane dockstate="right" visibility="0" width="525" row="1">
     <wetp:webextensionref xmlns:r="http://schemas.openxmlformats.org/officeDocument/2006/relationships" r:id="rId1"/>
   </wetp:taskpane>
 </wetp:taskpanes>

</xml_diff>